<commit_message>
add more form tag opts with enhancment
</commit_message>
<xml_diff>
--- a/cloudofficeprint/src/main/resources/BeginnerGuide/UsingForm/template.docx
+++ b/cloudofficeprint/src/main/resources/BeginnerGuide/UsingForm/template.docx
@@ -123,21 +123,11 @@
     <w:p/>
     <w:p>
       <w:r>
-        <w:t xml:space="preserve">Name: </w:t>
-      </w:r>
-      <w:proofErr w:type="gramStart"/>
-      <w:r>
-        <w:t>{?form</w:t>
-      </w:r>
-      <w:proofErr w:type="gramEnd"/>
-      <w:r>
-        <w:t xml:space="preserve"> </w:t>
-      </w:r>
-      <w:proofErr w:type="spellStart"/>
+        <w:t xml:space="preserve">Name: {?form </w:t>
+      </w:r>
       <w:r>
         <w:t>first_name</w:t>
       </w:r>
-      <w:proofErr w:type="spellEnd"/>
       <w:r>
         <w:t>}</w:t>
       </w:r>
@@ -152,21 +142,11 @@
       </w:r>
       <w:r>
         <w:tab/>
-        <w:t xml:space="preserve">Surname: </w:t>
-      </w:r>
-      <w:proofErr w:type="gramStart"/>
-      <w:r>
-        <w:t>{?form</w:t>
-      </w:r>
-      <w:proofErr w:type="gramEnd"/>
-      <w:r>
-        <w:t xml:space="preserve"> </w:t>
-      </w:r>
-      <w:proofErr w:type="spellStart"/>
+        <w:t xml:space="preserve">Surname: {?form </w:t>
+      </w:r>
       <w:r>
         <w:t>last_name</w:t>
       </w:r>
-      <w:proofErr w:type="spellEnd"/>
       <w:r>
         <w:t>}</w:t>
       </w:r>
@@ -183,21 +163,7 @@
         <w:rPr>
           <w:lang w:val="en-US"/>
         </w:rPr>
-        <w:t xml:space="preserve">Radio </w:t>
-      </w:r>
-      <w:proofErr w:type="gramStart"/>
-      <w:r>
-        <w:rPr>
-          <w:lang w:val="en-US"/>
-        </w:rPr>
-        <w:t>List :</w:t>
-      </w:r>
-      <w:proofErr w:type="gramEnd"/>
-      <w:r>
-        <w:rPr>
-          <w:lang w:val="en-US"/>
-        </w:rPr>
-        <w:t xml:space="preserve"> {#radiolist}</w:t>
+        <w:t>Radio List : {#radiolist}</w:t>
       </w:r>
     </w:p>
     <w:p>
@@ -208,82 +174,28 @@
           <w:numId w:val="1"/>
         </w:numPr>
       </w:pPr>
-      <w:proofErr w:type="gramStart"/>
       <w:r>
         <w:rPr>
           <w:lang w:val="en-US"/>
         </w:rPr>
-        <w:t>{?form</w:t>
-      </w:r>
-      <w:proofErr w:type="gramEnd"/>
-      <w:r>
+        <w:t>{?form this} {/radiolist}</w:t>
+      </w:r>
+    </w:p>
+    <w:p/>
+    <w:p/>
+    <w:p>
+      <w:pPr>
         <w:rPr>
           <w:lang w:val="en-US"/>
         </w:rPr>
-        <w:t xml:space="preserve"> </w:t>
-      </w:r>
-      <w:proofErr w:type="gramStart"/>
+      </w:pPr>
       <w:r>
         <w:rPr>
           <w:lang w:val="en-US"/>
         </w:rPr>
-        <w:t>this} {/</w:t>
-      </w:r>
-      <w:proofErr w:type="spellStart"/>
-      <w:proofErr w:type="gramEnd"/>
-      <w:r>
-        <w:rPr>
-          <w:lang w:val="en-US"/>
-        </w:rPr>
-        <w:t>radiolist</w:t>
-      </w:r>
-      <w:proofErr w:type="spellEnd"/>
-      <w:r>
-        <w:rPr>
-          <w:lang w:val="en-US"/>
-        </w:rPr>
-        <w:t>}</w:t>
-      </w:r>
-    </w:p>
-    <w:p/>
-    <w:p/>
-    <w:p>
-      <w:proofErr w:type="gramStart"/>
-      <w:r>
-        <w:rPr>
-          <w:lang w:val="en-US"/>
-        </w:rPr>
-        <w:t>{?form</w:t>
-      </w:r>
-      <w:proofErr w:type="gramEnd"/>
-      <w:r>
-        <w:rPr>
-          <w:lang w:val="en-US"/>
-        </w:rPr>
-        <w:t xml:space="preserve"> checkbox}</w:t>
-      </w:r>
-    </w:p>
-    <w:p/>
-    <w:p/>
-    <w:p/>
-    <w:p/>
-    <w:p/>
-    <w:p/>
-    <w:p/>
-    <w:p/>
-    <w:p/>
-    <w:p/>
-    <w:p/>
-    <w:p/>
-    <w:p/>
-    <w:p/>
-    <w:p/>
-    <w:p/>
-    <w:p/>
-    <w:p/>
-    <w:p/>
-    <w:p/>
-    <w:p/>
+        <w:t>{?form checkbox}</w:t>
+      </w:r>
+    </w:p>
     <w:p>
       <w:pPr>
         <w:rPr>
@@ -293,6 +205,66 @@
           <w:szCs w:val="21"/>
         </w:rPr>
       </w:pPr>
+    </w:p>
+    <w:p>
+      <w:r>
+        <w:t>Country: {?form country}</w:t>
+      </w:r>
+    </w:p>
+    <w:p/>
+    <w:p/>
+    <w:p>
+      <w:r>
+        <w:t>City: {?form city}</w:t>
+      </w:r>
+    </w:p>
+    <w:p/>
+    <w:p/>
+    <w:p>
+      <w:r>
+        <w:t>Roles: {?form roles}</w:t>
+      </w:r>
+    </w:p>
+    <w:p/>
+    <w:p/>
+    <w:p/>
+    <w:p/>
+    <w:p/>
+    <w:p>
+      <w:r>
+        <w:t>Password: {?form pw}</w:t>
+      </w:r>
+    </w:p>
+    <w:p/>
+    <w:p/>
+    <w:p>
+      <w:r>
+        <w:t>{?form submit}</w:t>
+      </w:r>
+    </w:p>
+    <w:p/>
+    <w:p/>
+    <w:p/>
+    <w:p/>
+    <w:p/>
+    <w:p/>
+    <w:p/>
+    <w:p/>
+    <w:p/>
+    <w:p/>
+    <w:p/>
+    <w:p/>
+    <w:p/>
+    <w:p/>
+    <w:p/>
+    <w:p/>
+    <w:p/>
+    <w:p/>
+    <w:p/>
+    <w:p/>
+    <w:p/>
+    <w:p/>
+    <w:p>
       <w:r>
         <w:rPr>
           <w:b/>

</xml_diff>